<commit_message>
Localize project documentation to Chinese
</commit_message>
<xml_diff>
--- a/doc/urban_renewal_experiment_full.docx
+++ b/doc/urban_renewal_experiment_full.docx
@@ -25,8 +25,9 @@
           <w:rFonts w:ascii="Times New Roman" w:hAnsi="Times New Roman" w:eastAsia="????"/>
           <w:sz w:val="22"/>
         </w:rPr>
-        <w:t>Full Version - 2026-04-16</w:t>
-      </w:r>
+        <w:t>完整版 - 2026-04-16</w:t>
+      </w:r>
+      <w:r/>
     </w:p>
     <w:p/>
     <w:p>

</xml_diff>